<commit_message>
docs: update dissertation testbed to isolated Windows 10 VM snapshot
Co-Authored-By: Claude Opus 5.5 <noreply@anthropic.com>
Claude-Session: https://claude.ai/code/session_01URgDNB5dt6RuEUq8PiP8xP
</commit_message>
<xml_diff>
--- a/docs/Dissertation_Chapters_1-3.docx
+++ b/docs/Dissertation_Chapters_1-3.docx
@@ -468,13 +468,13 @@
     <w:p>
       <w:pPr/>
       <w:r>
-        <w:t xml:space="preserve">The testbed was one standalone Windows 11 workstation running Python 3.11 in a virtual environment, with scikit-learn, SHAP, LIME, Streamlit, ReportLab and Volatility 3 installed from requirements.txt. The dashboard was started with --server.address localhost on port 8501, so no other host could reach it. Each run started from a fresh case folder, so earlier outputs could not affect later ones. No live malware was executed at any point. Malicious behaviour came only from CIC-MalMem2022 feature records and the synthetic profiles described in Section 3.5. Real memory images were captured only from my own machine. The only external connection was Volatility's one-time download of Windows symbol tables, made before any evidence was loaded; during test runs the workstation was disconnected from the network.</w:t>
-      </w:r>
-    </w:p>
-    <w:p>
-      <w:pPr/>
-      <w:r>
-        <w:t xml:space="preserve">The authorisation boundary is that single workstation and the data I own or am licensed to use. No third-party system, network or personal device was imaged, scanned or tested.</w:t>
+        <w:t xml:space="preserve">The testbed had two parts. Memory images came from a Windows 10 virtual machine running on my own computer. The VM was isolated from all networks. I took a snapshot of the VM and produced every memory dump from that snapshot only, so each image started from the same known state. The analysis tool ran on the host in a Python 3.11 virtual environment, with scikit-learn, SHAP, LIME, Streamlit, ReportLab and Volatility 3 installed from requirements.txt. The dashboard was bound to localhost on port 8501, and each run started from a fresh case folder. No live malware was executed. Malicious behaviour came only from CIC-MalMem2022 records and the synthetic profiles in Section 3.5. Volatility's one-time symbol download was the only external connection.</w:t>
+      </w:r>
+    </w:p>
+    <w:p>
+      <w:pPr/>
+      <w:r>
+        <w:t xml:space="preserve">The authorisation boundary is my own computer, the isolated VM and data I own or am licensed to use. No third-party system, network or device was imaged, scanned or tested.</w:t>
       </w:r>
     </w:p>
     <w:p>
@@ -556,7 +556,7 @@
     <w:p>
       <w:pPr/>
       <w:r>
-        <w:t xml:space="preserve">The main data is CIC-MalMem2022 (58,596 records), a public academic dataset stored locally in data/ and not committed to Git because of its size. It holds counts of operating-system artefacts, not personal data. Synthetic test data was generated by scripts (generate_synthetic_threats.py, simulate_zeroday.py), which alter real feature values to imitate a rootkit, ransomware, a fileless miner, Cobalt Strike beaconing and a zero-day. These profiles are labelled synthetic throughout. Memory dumps can expose passwords and documents, so only images of my own machine were used. They stay on an encrypted local disk and will be destroyed, with case folders and logs, after final marks are confirmed.</w:t>
+        <w:t xml:space="preserve">The main data is CIC-MalMem2022 (58,596 records), a public academic dataset stored locally in data/ and not committed to Git because of its size. It holds counts of operating-system artefacts, not personal data. Synthetic test data was generated by scripts (generate_synthetic_threats.py, simulate_zeroday.py), which alter real feature values to imitate a rootkit, ransomware, a fileless miner, Cobalt Strike beaconing and a zero-day. Memory dumps can expose passwords and documents, so I took them only from the snapshot of my isolated test VM, which holds no real user data. The dumps stay on my local disk and will be destroyed, with case folders and logs, after final marks are confirmed.</w:t>
       </w:r>
     </w:p>
     <w:p>
@@ -835,7 +835,7 @@
     <w:p>
       <w:pPr/>
       <w:r>
-        <w:t xml:space="preserve">The three chapters total 2,057 words against a target of 2,050. Counts exclude headings, the departures table (132 words) and the reference list.</w:t>
+        <w:t xml:space="preserve">The three chapters total 2,062 words against a target of 2,050. Counts exclude headings, the departures table (132 words) and the reference list.</w:t>
       </w:r>
     </w:p>
     <w:tbl>
@@ -1324,7 +1324,7 @@
           <w:p>
             <w:pPr/>
             <w:r>
-              <w:t xml:space="preserve">151</w:t>
+              <w:t xml:space="preserve">152</w:t>
             </w:r>
           </w:p>
         </w:tc>
@@ -1394,7 +1394,7 @@
           <w:p>
             <w:pPr/>
             <w:r>
-              <w:t xml:space="preserve">105</w:t>
+              <w:t xml:space="preserve">109</w:t>
             </w:r>
           </w:p>
         </w:tc>
@@ -1473,7 +1473,7 @@
               <w:rPr>
                 <w:b/>
               </w:rPr>
-              <w:t xml:space="preserve">906</w:t>
+              <w:t xml:space="preserve">911</w:t>
             </w:r>
           </w:p>
         </w:tc>
@@ -1517,7 +1517,7 @@
               <w:rPr>
                 <w:b/>
               </w:rPr>
-              <w:t xml:space="preserve">2,057</w:t>
+              <w:t xml:space="preserve">2,062</w:t>
             </w:r>
           </w:p>
         </w:tc>

</xml_diff>